<commit_message>
Fill in submitter details on the cover page
Adds the two submitters with their ID numbers, and switches the cover label
and the reflection chapter's first-person plural from feminine to masculine
forms to match them.

Co-Authored-By: Claude Fable 5 <noreply@anthropic.com>
Claude-Session: https://claude.ai/code/session_018uqi8SKvrZQyj5QaMMCpKK
</commit_message>
<xml_diff>
--- a/academic-papers/עבודת סיכום - מוגבלות בלתי נראית ב - אזה הולמס.docx
+++ b/academic-papers/עבודת סיכום - מוגבלות בלתי נראית ב - אזה הולמס.docx
@@ -172,7 +172,7 @@
           <w:szCs w:val="24"/>
           <w:rtl/>
         </w:rPr>
-        <w:t xml:space="preserve">מגישות:</w:t>
+        <w:t xml:space="preserve">מגישים:</w:t>
       </w:r>
     </w:p>
     <w:p>
@@ -188,7 +188,7 @@
           <w:szCs w:val="24"/>
           <w:rtl/>
         </w:rPr>
-        <w:t xml:space="preserve">______________________    ת.ז. ______________</w:t>
+        <w:t xml:space="preserve">רביע אלטורי, ת.ז. 209529783</w:t>
       </w:r>
     </w:p>
     <w:p>
@@ -204,7 +204,7 @@
           <w:szCs w:val="24"/>
           <w:rtl/>
         </w:rPr>
-        <w:t xml:space="preserve">______________________    ת.ז. ______________</w:t>
+        <w:t xml:space="preserve">רדואן אלטורי, ת.ז. 300632767</w:t>
       </w:r>
     </w:p>
     <w:p>
@@ -688,7 +688,7 @@
           <w:szCs w:val="24"/>
           <w:rtl/>
         </w:rPr>
-        <w:t xml:space="preserve">אם תלמידה כמו אזה הייתה מגיעה לכיתה שלנו, סביר שלא היינו יודעות דבר. זו נקודת הפתיחה שצריכה להנחות אותנו, ומכאן נגזרות כמה החלטות מעשיות.</w:t>
+        <w:t xml:space="preserve">אם תלמידה כמו אזה הייתה מגיעה לכיתה שלנו, סביר שלא היינו יודעים דבר. זו נקודת הפתיחה שצריכה להנחות אותנו, ומכאן נגזרות כמה החלטות מעשיות.</w:t>
       </w:r>
     </w:p>
     <w:p>

</xml_diff>

<commit_message>
Add the missing volume number to the Finkelstein (2014) reference
The syllabus lists this article with an issue number but no volume. Two
independent bibliographic records give volume 15, so the entry now reads
15(2), 389-415 instead of the bare (2).

Co-Authored-By: Claude Fable 5 <noreply@anthropic.com>
Claude-Session: https://claude.ai/code/session_018uqi8SKvrZQyj5QaMMCpKK
</commit_message>
<xml_diff>
--- a/academic-papers/עבודת סיכום - מוגבלות בלתי נראית ב - אזה הולמס.docx
+++ b/academic-papers/עבודת סיכום - מוגבלות בלתי נראית ב - אזה הולמס.docx
@@ -1041,16 +1041,16 @@
           <w:szCs w:val="24"/>
           <w:rtl/>
         </w:rPr>
-        <w:t xml:space="preserve"> סוציולוגיה ישראלית, (2)</w:t>
-      </w:r>
-      <w:r>
-        <w:rPr>
-          <w:rFonts w:ascii="David" w:cs="David" w:eastAsia="David" w:hAnsi="David"/>
-          <w:sz w:val="24"/>
-          <w:szCs w:val="24"/>
-          <w:rtl/>
-        </w:rPr>
-        <w:t xml:space="preserve">, 389-415.</w:t>
+        <w:t xml:space="preserve"> סוציולוגיה ישראלית, 15</w:t>
+      </w:r>
+      <w:r>
+        <w:rPr>
+          <w:rFonts w:ascii="David" w:cs="David" w:eastAsia="David" w:hAnsi="David"/>
+          <w:sz w:val="24"/>
+          <w:szCs w:val="24"/>
+          <w:rtl/>
+        </w:rPr>
+        <w:t xml:space="preserve">(2), 389-415.</w:t>
       </w:r>
     </w:p>
     <w:p>

</xml_diff>

<commit_message>
Correct the cover logo size from 3.6 cm to 5 cm
docx-js transformation values are pixels at 96 dpi, not points, so the previous
value rendered the logo at 3.6 cm rather than the intended width. Sizing it from
the pixel basis puts it at 5 cm wide on the cover.

Co-Authored-By: Claude Fable 5 <noreply@anthropic.com>
Claude-Session: https://claude.ai/code/session_018uqi8SKvrZQyj5QaMMCpKK
</commit_message>
<xml_diff>
--- a/academic-papers/עבודת סיכום - מוגבלות בלתי נראית ב - אזה הולמס.docx
+++ b/academic-papers/עבודת סיכום - מוגבלות בלתי נראית ב - אזה הולמס.docx
@@ -10,7 +10,7 @@
       <w:r>
         <w:drawing>
           <wp:inline distT="0" distB="0" distL="0" distR="0">
-            <wp:extent cx="1295400" cy="638175"/>
+            <wp:extent cx="1800225" cy="885825"/>
             <wp:effectExtent t="0" r="0" b="0" l="0"/>
             <wp:docPr id="1" name="logo" descr="לוגו הקריה האקדמית אונו" title="הקריה האקדמית אונו"/>
             <wp:cNvGraphicFramePr>
@@ -35,7 +35,7 @@
                   <pic:spPr bwMode="auto">
                     <a:xfrm>
                       <a:off x="0" y="0"/>
-                      <a:ext cx="1295400" cy="638175"/>
+                      <a:ext cx="1800225" cy="885825"/>
                     </a:xfrm>
                     <a:prstGeom prst="rect">
                       <a:avLst/>

</xml_diff>